<commit_message>
Finished scientific production report. Fixed bugs.
</commit_message>
<xml_diff>
--- a/src/main/resources/reportTemplates/tableScientificProductionTemplate.docx
+++ b/src/main/resources/reportTemplates/tableScientificProductionTemplate.docx
@@ -9,16 +9,15 @@
       </w:pPr>
       <w:r>
         <w:rPr/>
-        <w:t>{heading}</w:t>
-      </w:r>
-    </w:p>
-    <w:p>
-      <w:pPr>
-        <w:pStyle w:val="LOnormal"/>
-        <w:rPr/>
-      </w:pPr>
-      <w:r>
-        <w:rPr/>
+        <w:t>{heading</w:t>
+      </w:r>
+      <w:r>
+        <w:rPr/>
+        <w:t>1</w:t>
+      </w:r>
+      <w:r>
+        <w:rPr/>
+        <w:t>}</w:t>
       </w:r>
     </w:p>
     <w:tbl>
@@ -40,7 +39,7 @@
         <w:gridCol w:w="1872"/>
         <w:gridCol w:w="2538"/>
         <w:gridCol w:w="2340"/>
-        <w:gridCol w:w="2610"/>
+        <w:gridCol w:w="2609"/>
       </w:tblGrid>
       <w:tr>
         <w:trPr/>
@@ -137,7 +136,7 @@
         </w:tc>
         <w:tc>
           <w:tcPr>
-            <w:tcW w:w="2610" w:type="dxa"/>
+            <w:tcW w:w="2609" w:type="dxa"/>
             <w:tcBorders>
               <w:top w:val="single" w:sz="8" w:space="0" w:color="000000"/>
               <w:left w:val="single" w:sz="8" w:space="0" w:color="000000"/>
@@ -184,36 +183,48 @@
       </w:pPr>
       <w:r>
         <w:rPr/>
+        <w:t>{heading</w:t>
+      </w:r>
+      <w:r>
+        <w:rPr/>
+        <w:t>2</w:t>
+      </w:r>
+      <w:r>
+        <w:rPr/>
+        <w:t>}</w:t>
       </w:r>
     </w:p>
     <w:tbl>
       <w:tblPr>
-        <w:tblW w:w="5000" w:type="pct"/>
+        <w:tblStyle w:val="Table1"/>
+        <w:tblW w:w="9360" w:type="dxa"/>
         <w:jc w:val="left"/>
-        <w:tblInd w:w="-113" w:type="dxa"/>
+        <w:tblInd w:w="0" w:type="dxa"/>
         <w:tblLayout w:type="fixed"/>
         <w:tblCellMar>
-          <w:top w:w="0" w:type="dxa"/>
-          <w:left w:w="108" w:type="dxa"/>
-          <w:bottom w:w="0" w:type="dxa"/>
-          <w:right w:w="108" w:type="dxa"/>
+          <w:top w:w="100" w:type="dxa"/>
+          <w:left w:w="100" w:type="dxa"/>
+          <w:bottom w:w="100" w:type="dxa"/>
+          <w:right w:w="100" w:type="dxa"/>
         </w:tblCellMar>
+        <w:tblLook w:val="0600"/>
       </w:tblPr>
       <w:tblGrid>
-        <w:gridCol w:w="4679"/>
-        <w:gridCol w:w="4680"/>
+        <w:gridCol w:w="4410"/>
+        <w:gridCol w:w="4949"/>
       </w:tblGrid>
       <w:tr>
         <w:trPr/>
         <w:tc>
           <w:tcPr>
-            <w:tcW w:w="4679" w:type="dxa"/>
+            <w:tcW w:w="4410" w:type="dxa"/>
             <w:tcBorders>
-              <w:top w:val="single" w:sz="4" w:space="0" w:color="000000"/>
-              <w:left w:val="single" w:sz="4" w:space="0" w:color="000000"/>
-              <w:bottom w:val="single" w:sz="4" w:space="0" w:color="000000"/>
-              <w:right w:val="single" w:sz="4" w:space="0" w:color="000000"/>
+              <w:top w:val="single" w:sz="8" w:space="0" w:color="000000"/>
+              <w:left w:val="single" w:sz="8" w:space="0" w:color="000000"/>
+              <w:bottom w:val="single" w:sz="8" w:space="0" w:color="000000"/>
+              <w:right w:val="single" w:sz="8" w:space="0" w:color="000000"/>
             </w:tcBorders>
+            <w:shd w:fill="auto" w:val="clear"/>
           </w:tcPr>
           <w:p>
             <w:pPr>
@@ -221,21 +232,28 @@
               <w:widowControl w:val="false"/>
               <w:rPr/>
             </w:pPr>
-            <w:r>
-              <w:rPr/>
-              <w:t>{col1}</w:t>
+            <w:bookmarkStart w:id="7" w:name="__DdeLink__13_29040548381"/>
+            <w:r>
+              <w:rPr/>
+              <w:t>{</w:t>
+            </w:r>
+            <w:bookmarkEnd w:id="7"/>
+            <w:r>
+              <w:rPr/>
+              <w:t>col1}</w:t>
             </w:r>
           </w:p>
         </w:tc>
         <w:tc>
           <w:tcPr>
-            <w:tcW w:w="4680" w:type="dxa"/>
+            <w:tcW w:w="4949" w:type="dxa"/>
             <w:tcBorders>
-              <w:top w:val="single" w:sz="4" w:space="0" w:color="000000"/>
-              <w:left w:val="single" w:sz="4" w:space="0" w:color="000000"/>
-              <w:bottom w:val="single" w:sz="4" w:space="0" w:color="000000"/>
-              <w:right w:val="single" w:sz="4" w:space="0" w:color="000000"/>
+              <w:top w:val="single" w:sz="8" w:space="0" w:color="000000"/>
+              <w:left w:val="single" w:sz="8" w:space="0" w:color="000000"/>
+              <w:bottom w:val="single" w:sz="8" w:space="0" w:color="000000"/>
+              <w:right w:val="single" w:sz="8" w:space="0" w:color="000000"/>
             </w:tcBorders>
+            <w:shd w:fill="auto" w:val="clear"/>
           </w:tcPr>
           <w:p>
             <w:pPr>
@@ -243,17 +261,25 @@
               <w:widowControl w:val="false"/>
               <w:rPr/>
             </w:pPr>
-            <w:r>
-              <w:rPr/>
-              <w:t>{col2}</w:t>
-            </w:r>
+            <w:bookmarkStart w:id="8" w:name="__DdeLink__15_29040548381"/>
+            <w:bookmarkStart w:id="9" w:name="__DdeLink__13_290405483821"/>
+            <w:r>
+              <w:rPr/>
+              <w:t>{</w:t>
+            </w:r>
+            <w:bookmarkEnd w:id="9"/>
+            <w:r>
+              <w:rPr/>
+              <w:t>col2}</w:t>
+            </w:r>
+            <w:bookmarkEnd w:id="8"/>
           </w:p>
         </w:tc>
       </w:tr>
     </w:tbl>
     <w:p>
       <w:pPr>
-        <w:pStyle w:val="LOnormal"/>
+        <w:pStyle w:val="Normal"/>
         <w:rPr/>
       </w:pPr>
       <w:r>
@@ -262,11 +288,20 @@
     </w:p>
     <w:p>
       <w:pPr>
-        <w:pStyle w:val="LOnormal"/>
+        <w:pStyle w:val="Normal"/>
         <w:rPr/>
       </w:pPr>
       <w:r>
         <w:rPr/>
+        <w:t>{heading</w:t>
+      </w:r>
+      <w:r>
+        <w:rPr/>
+        <w:t>3</w:t>
+      </w:r>
+      <w:r>
+        <w:rPr/>
+        <w:t>}</w:t>
       </w:r>
     </w:p>
     <w:tbl>

</xml_diff>

<commit_message>
Fixed reporting issues. Various smaller bugfixes.
</commit_message>
<xml_diff>
--- a/src/main/resources/reportTemplates/tableScientificProductionTemplate.docx
+++ b/src/main/resources/reportTemplates/tableScientificProductionTemplate.docx
@@ -9,15 +9,7 @@
       </w:pPr>
       <w:r>
         <w:rPr/>
-        <w:t>{heading</w:t>
-      </w:r>
-      <w:r>
-        <w:rPr/>
-        <w:t>1</w:t>
-      </w:r>
-      <w:r>
-        <w:rPr/>
-        <w:t>}</w:t>
+        <w:t>{heading1}</w:t>
       </w:r>
     </w:p>
     <w:tbl>
@@ -183,15 +175,7 @@
       </w:pPr>
       <w:r>
         <w:rPr/>
-        <w:t>{heading</w:t>
-      </w:r>
-      <w:r>
-        <w:rPr/>
-        <w:t>2</w:t>
-      </w:r>
-      <w:r>
-        <w:rPr/>
-        <w:t>}</w:t>
+        <w:t>{heading2}</w:t>
       </w:r>
     </w:p>
     <w:tbl>
@@ -240,7 +224,7 @@
             <w:bookmarkEnd w:id="7"/>
             <w:r>
               <w:rPr/>
-              <w:t>col1}</w:t>
+              <w:t>col5}</w:t>
             </w:r>
           </w:p>
         </w:tc>
@@ -270,7 +254,7 @@
             <w:bookmarkEnd w:id="9"/>
             <w:r>
               <w:rPr/>
-              <w:t>col2}</w:t>
+              <w:t>col6}</w:t>
             </w:r>
             <w:bookmarkEnd w:id="8"/>
           </w:p>
@@ -293,15 +277,7 @@
       </w:pPr>
       <w:r>
         <w:rPr/>
-        <w:t>{heading</w:t>
-      </w:r>
-      <w:r>
-        <w:rPr/>
-        <w:t>3</w:t>
-      </w:r>
-      <w:r>
-        <w:rPr/>
-        <w:t>}</w:t>
+        <w:t>{heading3}</w:t>
       </w:r>
     </w:p>
     <w:tbl>
@@ -346,7 +322,15 @@
             </w:pPr>
             <w:r>
               <w:rPr/>
-              <w:t>{col1}</w:t>
+              <w:t>{col</w:t>
+            </w:r>
+            <w:r>
+              <w:rPr/>
+              <w:t>5</w:t>
+            </w:r>
+            <w:r>
+              <w:rPr/>
+              <w:t>}</w:t>
             </w:r>
           </w:p>
         </w:tc>
@@ -369,7 +353,15 @@
             </w:pPr>
             <w:r>
               <w:rPr/>
-              <w:t>{col2}</w:t>
+              <w:t>{col</w:t>
+            </w:r>
+            <w:r>
+              <w:rPr/>
+              <w:t>6</w:t>
+            </w:r>
+            <w:r>
+              <w:rPr/>
+              <w:t>}</w:t>
             </w:r>
           </w:p>
         </w:tc>
@@ -392,7 +384,15 @@
             </w:pPr>
             <w:r>
               <w:rPr/>
-              <w:t>{col3}</w:t>
+              <w:t>{col</w:t>
+            </w:r>
+            <w:r>
+              <w:rPr/>
+              <w:t>7</w:t>
+            </w:r>
+            <w:r>
+              <w:rPr/>
+              <w:t>}</w:t>
             </w:r>
           </w:p>
         </w:tc>
@@ -415,7 +415,15 @@
             </w:pPr>
             <w:r>
               <w:rPr/>
-              <w:t>{col4}</w:t>
+              <w:t>{col</w:t>
+            </w:r>
+            <w:r>
+              <w:rPr/>
+              <w:t>8</w:t>
+            </w:r>
+            <w:r>
+              <w:rPr/>
+              <w:t>}</w:t>
             </w:r>
           </w:p>
         </w:tc>

</xml_diff>